<commit_message>
Skills: Web Scraping/Crawling 삭제, AI Agent Engineering 추가
- 홈페이지 Skills and Techniques 3번 항목 교체
- CV Technical Skills & Methods에 AI agent engineering 추가(3번째), web scraping/crawling 삭제

Co-Authored-By: Claude Opus 5.5 <noreply@anthropic.com>
Claude-Session: https://claude.ai/code/session_0113G1MtAtxvN3iLx11yNCo1
</commit_message>
<xml_diff>
--- a/files/ByungjunKim_CV_2609.docx
+++ b/files/ByungjunKim_CV_2609.docx
@@ -7762,105 +7762,15 @@
           <w:sz w:val="20"/>
           <w:szCs w:val="20"/>
         </w:rPr>
-        <w:t xml:space="preserve">Bibliometrics and network analysis: </w:t>
-      </w:r>
-      <w:r>
-        <w:rPr>
-          <w:rFonts w:ascii="Pretendard" w:eastAsia="Pretendard" w:hAnsi="Pretendard"/>
-          <w:sz w:val="20"/>
-          <w:szCs w:val="20"/>
-        </w:rPr>
-        <w:t xml:space="preserve">KCI, </w:t>
-      </w:r>
-      <w:proofErr w:type="spellStart"/>
-      <w:r>
-        <w:rPr>
-          <w:rFonts w:ascii="Pretendard" w:eastAsia="Pretendard" w:hAnsi="Pretendard"/>
-          <w:sz w:val="20"/>
-          <w:szCs w:val="20"/>
-        </w:rPr>
-        <w:t>OpenAlex</w:t>
-      </w:r>
-      <w:proofErr w:type="spellEnd"/>
-      <w:r>
-        <w:rPr>
-          <w:rFonts w:ascii="Pretendard" w:eastAsia="Pretendard" w:hAnsi="Pretendard"/>
-          <w:sz w:val="20"/>
-          <w:szCs w:val="20"/>
-        </w:rPr>
-        <w:t xml:space="preserve">, citation and reference data; Gephi, </w:t>
-      </w:r>
-      <w:proofErr w:type="spellStart"/>
-      <w:r>
-        <w:rPr>
-          <w:rFonts w:ascii="Pretendard" w:eastAsia="Pretendard" w:hAnsi="Pretendard"/>
-          <w:sz w:val="20"/>
-          <w:szCs w:val="20"/>
-        </w:rPr>
-        <w:t>networkx</w:t>
-      </w:r>
-      <w:proofErr w:type="spellEnd"/>
-      <w:r>
-        <w:rPr>
-          <w:rFonts w:ascii="Pretendard" w:eastAsia="Pretendard" w:hAnsi="Pretendard"/>
-          <w:sz w:val="20"/>
-          <w:szCs w:val="20"/>
-        </w:rPr>
-        <w:t xml:space="preserve">, </w:t>
-      </w:r>
-      <w:proofErr w:type="spellStart"/>
-      <w:r>
-        <w:rPr>
-          <w:rFonts w:ascii="Pretendard" w:eastAsia="Pretendard" w:hAnsi="Pretendard"/>
-          <w:sz w:val="20"/>
-          <w:szCs w:val="20"/>
-        </w:rPr>
-        <w:t>igraph</w:t>
-      </w:r>
-      <w:proofErr w:type="spellEnd"/>
-      <w:r>
-        <w:rPr>
-          <w:rFonts w:ascii="Pretendard" w:eastAsia="Pretendard" w:hAnsi="Pretendard"/>
-          <w:sz w:val="20"/>
-          <w:szCs w:val="20"/>
-        </w:rPr>
-        <w:t xml:space="preserve">, </w:t>
-      </w:r>
-      <w:proofErr w:type="spellStart"/>
-      <w:r>
-        <w:rPr>
-          <w:rFonts w:ascii="Pretendard" w:eastAsia="Pretendard" w:hAnsi="Pretendard"/>
-          <w:sz w:val="20"/>
-          <w:szCs w:val="20"/>
-        </w:rPr>
-        <w:t>VOSviewer</w:t>
-      </w:r>
-      <w:proofErr w:type="spellEnd"/>
-      <w:r>
-        <w:rPr>
-          <w:rFonts w:ascii="Pretendard" w:eastAsia="Pretendard" w:hAnsi="Pretendard"/>
-          <w:sz w:val="20"/>
-          <w:szCs w:val="20"/>
-        </w:rPr>
-        <w:t xml:space="preserve">, </w:t>
-      </w:r>
-      <w:proofErr w:type="spellStart"/>
-      <w:r>
-        <w:rPr>
-          <w:rFonts w:ascii="Pretendard" w:eastAsia="Pretendard" w:hAnsi="Pretendard"/>
-          <w:sz w:val="20"/>
-          <w:szCs w:val="20"/>
-        </w:rPr>
-        <w:t>CiteSpace</w:t>
-      </w:r>
-      <w:proofErr w:type="spellEnd"/>
-      <w:r>
-        <w:rPr>
-          <w:rFonts w:ascii="Pretendard" w:eastAsia="Pretendard" w:hAnsi="Pretendard"/>
-          <w:sz w:val="20"/>
-          <w:szCs w:val="20"/>
-        </w:rPr>
-        <w:t>.</w:t>
+        <w:t xml:space="preserve">AI agent engineering: </w:t>
+      </w:r>
+      <w:r>
+        <w:rPr>
+          <w:rFonts w:ascii="Pretendard" w:eastAsia="Pretendard" w:hAnsi="Pretendard"/>
+          <w:sz w:val="20"/>
+          <w:szCs w:val="20"/>
+        </w:rPr>
+        <w:t>LLM-based agents, tool use, and agentic research workflows.</w:t>
       </w:r>
     </w:p>
     <w:p>
@@ -7885,6 +7795,129 @@
           <w:sz w:val="20"/>
           <w:szCs w:val="20"/>
         </w:rPr>
+        <w:t xml:space="preserve">Bibliometrics and network analysis: </w:t>
+      </w:r>
+      <w:r>
+        <w:rPr>
+          <w:rFonts w:ascii="Pretendard" w:eastAsia="Pretendard" w:hAnsi="Pretendard"/>
+          <w:sz w:val="20"/>
+          <w:szCs w:val="20"/>
+        </w:rPr>
+        <w:t xml:space="preserve">KCI, </w:t>
+      </w:r>
+      <w:proofErr w:type="spellStart"/>
+      <w:r>
+        <w:rPr>
+          <w:rFonts w:ascii="Pretendard" w:eastAsia="Pretendard" w:hAnsi="Pretendard"/>
+          <w:sz w:val="20"/>
+          <w:szCs w:val="20"/>
+        </w:rPr>
+        <w:t>OpenAlex</w:t>
+      </w:r>
+      <w:proofErr w:type="spellEnd"/>
+      <w:r>
+        <w:rPr>
+          <w:rFonts w:ascii="Pretendard" w:eastAsia="Pretendard" w:hAnsi="Pretendard"/>
+          <w:sz w:val="20"/>
+          <w:szCs w:val="20"/>
+        </w:rPr>
+        <w:t xml:space="preserve">, citation and reference data; Gephi, </w:t>
+      </w:r>
+      <w:proofErr w:type="spellStart"/>
+      <w:r>
+        <w:rPr>
+          <w:rFonts w:ascii="Pretendard" w:eastAsia="Pretendard" w:hAnsi="Pretendard"/>
+          <w:sz w:val="20"/>
+          <w:szCs w:val="20"/>
+        </w:rPr>
+        <w:t>networkx</w:t>
+      </w:r>
+      <w:proofErr w:type="spellEnd"/>
+      <w:r>
+        <w:rPr>
+          <w:rFonts w:ascii="Pretendard" w:eastAsia="Pretendard" w:hAnsi="Pretendard"/>
+          <w:sz w:val="20"/>
+          <w:szCs w:val="20"/>
+        </w:rPr>
+        <w:t xml:space="preserve">, </w:t>
+      </w:r>
+      <w:proofErr w:type="spellStart"/>
+      <w:r>
+        <w:rPr>
+          <w:rFonts w:ascii="Pretendard" w:eastAsia="Pretendard" w:hAnsi="Pretendard"/>
+          <w:sz w:val="20"/>
+          <w:szCs w:val="20"/>
+        </w:rPr>
+        <w:t>igraph</w:t>
+      </w:r>
+      <w:proofErr w:type="spellEnd"/>
+      <w:r>
+        <w:rPr>
+          <w:rFonts w:ascii="Pretendard" w:eastAsia="Pretendard" w:hAnsi="Pretendard"/>
+          <w:sz w:val="20"/>
+          <w:szCs w:val="20"/>
+        </w:rPr>
+        <w:t xml:space="preserve">, </w:t>
+      </w:r>
+      <w:proofErr w:type="spellStart"/>
+      <w:r>
+        <w:rPr>
+          <w:rFonts w:ascii="Pretendard" w:eastAsia="Pretendard" w:hAnsi="Pretendard"/>
+          <w:sz w:val="20"/>
+          <w:szCs w:val="20"/>
+        </w:rPr>
+        <w:t>VOSviewer</w:t>
+      </w:r>
+      <w:proofErr w:type="spellEnd"/>
+      <w:r>
+        <w:rPr>
+          <w:rFonts w:ascii="Pretendard" w:eastAsia="Pretendard" w:hAnsi="Pretendard"/>
+          <w:sz w:val="20"/>
+          <w:szCs w:val="20"/>
+        </w:rPr>
+        <w:t xml:space="preserve">, </w:t>
+      </w:r>
+      <w:proofErr w:type="spellStart"/>
+      <w:r>
+        <w:rPr>
+          <w:rFonts w:ascii="Pretendard" w:eastAsia="Pretendard" w:hAnsi="Pretendard"/>
+          <w:sz w:val="20"/>
+          <w:szCs w:val="20"/>
+        </w:rPr>
+        <w:t>CiteSpace</w:t>
+      </w:r>
+      <w:proofErr w:type="spellEnd"/>
+      <w:r>
+        <w:rPr>
+          <w:rFonts w:ascii="Pretendard" w:eastAsia="Pretendard" w:hAnsi="Pretendard"/>
+          <w:sz w:val="20"/>
+          <w:szCs w:val="20"/>
+        </w:rPr>
+        <w:t>.</w:t>
+      </w:r>
+    </w:p>
+    <w:p>
+      <w:pPr>
+        <w:pStyle w:val="a4"/>
+        <w:numPr>
+          <w:ilvl w:val="0"/>
+          <w:numId w:val="2"/>
+        </w:numPr>
+        <w:spacing w:after="70"/>
+        <w:rPr>
+          <w:rFonts w:ascii="Pretendard" w:eastAsia="Pretendard" w:hAnsi="Pretendard"/>
+          <w:sz w:val="20"/>
+          <w:szCs w:val="20"/>
+        </w:rPr>
+      </w:pPr>
+      <w:r>
+        <w:rPr>
+          <w:rFonts w:ascii="Pretendard" w:eastAsia="Pretendard" w:hAnsi="Pretendard"/>
+          <w:b/>
+          <w:bCs/>
+          <w:sz w:val="20"/>
+          <w:szCs w:val="20"/>
+        </w:rPr>
         <w:t xml:space="preserve">Knowledge organization and data infrastructure: </w:t>
       </w:r>
       <w:r>
@@ -7893,7 +7926,7 @@
           <w:sz w:val="20"/>
           <w:szCs w:val="20"/>
         </w:rPr>
-        <w:t>corpus and dataset construction, metadata and TEI/XML, Linked Open Data (RDF/SPARQL), RDBMS, NoSQL, web scraping and crawling.</w:t>
+        <w:t>corpus and dataset construction, metadata and TEI/XML, Linked Open Data (RDF/SPARQL), RDBMS, NoSQL.</w:t>
       </w:r>
     </w:p>
     <w:p>

</xml_diff>